<commit_message>
ISTSS decks: precise prevalence labels (crude vs model-predicted) with Stata commands; scripts updated
Co-Authored-By: Claude Opus 5.5 <noreply@anthropic.com>
Claude-Session: https://claude.ai/code/session_019BJ4u1WYcsA14q2B552n7R
</commit_message>
<xml_diff>
--- a/projects/marvin-stress-trauma/istss_scripts_STROBE.docx
+++ b/projects/marvin-stress-trauma/istss_scripts_STROBE.docx
@@ -13,6 +13,30 @@
     <w:p>
       <w:r>
         <w:t>Thursday 24 September 2026, Salon C. Talk 2 (on behalf of Dr. Salma Abdalla) runs straight into Talk 3 without a pause. The scripts below are identical to the speaker notes in each deck.</w:t>
+      </w:r>
+    </w:p>
+    <w:p>
+      <w:pPr>
+        <w:pStyle w:val="Heading1"/>
+      </w:pPr>
+      <w:r>
+        <w:t>What "prevalence" means in each talk</w:t>
+      </w:r>
+    </w:p>
+    <w:p>
+      <w:pPr>
+        <w:pStyle w:val="ListBullet"/>
+      </w:pPr>
+      <w:r>
+        <w:t>Talk 2 (Salma): prevalence estimates are crude proportions; only the 95% CIs account for the clustered design (Stata svy: proportion). The adjusted quantities are the prevalence ratios from svy: poisson.</w:t>
+      </w:r>
+    </w:p>
+    <w:p>
+      <w:pPr>
+        <w:pStyle w:val="ListBullet"/>
+      </w:pPr>
+      <w:r>
+        <w:t>Talk 3 (Mohammed): model-predicted prevalence from the Poisson model via Stata margins: each participant's probability is predicted at fixed trauma and stressor values, keeping their own age, gender, education, and state, then averaged (marginal standardization). Absolute differences are margins contrasts; per-stressor ratios are lincom estimates.</w:t>
       </w:r>
     </w:p>
     <w:p>
@@ -260,7 +284,7 @@
     </w:p>
     <w:p>
       <w:r>
-        <w:t>Design-adjusted prevalence was 18.5 percent for probable PTSD, 21 percent for depression, and 20.7 percent for anxiety: at least one adult in five met criteria for each condition, and 30.4 percent met criteria for at least one. Those of you who read the program will see slightly different figures there; the abstract carried preliminary estimates, and these are the final estimates from the fully cleaned sample. The conditions travel together: among people with any condition, more than a third met criteria for all three. The design effects, close to seven, are the first sign that the burden clusters by community.</w:t>
+        <w:t>Prevalence was 18.5 percent for probable PTSD, 21 percent for depression, and 20.7 percent for anxiety. These are crude proportions; only the confidence intervals account for the clustered design. At that level, at least one adult in five met criteria for each condition, and 30.4 percent met criteria for at least one. Those of you who read the program will see slightly different figures there; the abstract carried preliminary estimates, and these are the final estimates from the fully cleaned sample. The conditions travel together: among people with any condition, more than a third met criteria for all three. The design effects, close to seven, are the first sign that the burden clusters by community.</w:t>
       </w:r>
     </w:p>
     <w:p>
@@ -292,7 +316,7 @@
     </w:p>
     <w:p>
       <w:r>
-        <w:t>Both do. In Model A, each additional traumatic event is associated with about 15 percent higher prevalence of each condition. In Model B, living in a camp is associated with roughly twice the prevalence of PTSD and depression and nearly three times the prevalence of anxiety, after accounting for trauma. The trauma estimates hardly move when camp residence enters the model. These are two separable pathways: what happened to people, and where they now live.</w:t>
+        <w:t>Both do. In Model A, each additional traumatic event is associated with about 15 percent higher prevalence of each condition. In Model B, living in a camp is associated with roughly twice the prevalence of PTSD and depression and nearly three times the prevalence of anxiety, after accounting for trauma. The trauma estimates hardly move when camp residence enters the model. Note that it is these prevalence ratios, not the prevalences on the previous slides, that are adjusted. These are two separable pathways: what happened to people, and where they now live.</w:t>
       </w:r>
     </w:p>
     <w:p>
@@ -385,7 +409,7 @@
         <w:rPr>
           <w:i/>
         </w:rPr>
-        <w:t>About 1389 words, roughly 10.7 minutes at 130 words per minute.</w:t>
+        <w:t>About 1421 words, roughly 10.9 minutes at 130 words per minute.</w:t>
       </w:r>
     </w:p>
     <w:p>
@@ -644,12 +668,12 @@
         <w:rPr>
           <w:b/>
         </w:rPr>
-        <w:t>[Slide 16 · Results] Outcome Data: PTSD by Trauma Exposure</w:t>
+        <w:t>[Slide 16 · Results] Outcome Data: PTSD by Trauma</w:t>
       </w:r>
     </w:p>
     <w:p>
       <w:r>
-        <w:t>First, the main effect, so the interaction has context. At zero stressors, adjusted PTSD prevalence rises from about 7 percent among people with no trauma to about 40 percent at five events. Trauma dominates the risk landscape. That part is expected. The question is what happens to the stress gradient along the way.</w:t>
+        <w:t>First, the main effect, so the interaction has context. At zero stressors, model-predicted PTSD prevalence rises from about 7 percent among people with no trauma to about 40 percent at five events. Trauma dominates the risk landscape. These are predicted prevalences from the Poisson model using Stata's margins: each person's probability is predicted at a fixed trauma and stressor level, keeping their own age, gender, education, and state, and the predictions are averaged. That standardizes the comparison to the same covariate mix. The gradient itself is expected. The question is what happens to the stress gradient along the way.</w:t>
       </w:r>
     </w:p>
     <w:p>
@@ -697,7 +721,7 @@
     </w:p>
     <w:p>
       <w:r>
-        <w:t>A sceptic would say the ratio fades only because people with heavy trauma already have high prevalence. So here is the same comparison in percentage points. Going from zero to four stressors adds about 22 points of PTSD prevalence among people with no trauma exposure, 24 points of depression, and 18 points of anxiety. Among people with five or more events, the same four stressors add nothing measurable to any of the three. The fading appears in percentage points too, so it is not an artifact of the ratio scale.</w:t>
+        <w:t>A sceptic would say the ratio fades only because people with heavy trauma already have high prevalence. So here is the same comparison in percentage points, as differences in model-predicted prevalence estimated with margins contrasts. Going from zero to four stressors adds about 22 points of PTSD prevalence among people with no trauma exposure, 24 points of depression, and 18 points of anxiety. Among people with five or more events, the same four stressors add nothing measurable to any of the three. The fading appears in percentage points too, so it is not an artifact of the ratio scale.</w:t>
       </w:r>
     </w:p>
     <w:p>
@@ -713,7 +737,7 @@
     </w:p>
     <w:p>
       <w:r>
-        <w:t>Here is the same result as prevalence. Each line is a level of trauma. The red line, no trauma exposure, rises from about 7 percent to 28 percent across four stressors and keeps climbing. Each step up in trauma rotates the line flatter, and at five or more events the line is high and does not rise with stress; if anything it drifts down. The gradient belongs to people with little trauma; the burden belongs to people with a lot. Depression and anxiety fan out the same way.</w:t>
+        <w:t>Here is the same result as model-predicted prevalence. Each line is a level of trauma. The red line, no trauma exposure, rises from about 7 percent to 28 percent across four stressors and keeps climbing. Each step up in trauma rotates the line flatter, and at five or more events the line is high and does not rise with stress; if anything it drifts down. The gradient belongs to people with little trauma; the burden belongs to people with a lot. Depression and anxiety fan out the same way.</w:t>
       </w:r>
     </w:p>
     <w:p>
@@ -838,7 +862,7 @@
         <w:rPr>
           <w:i/>
         </w:rPr>
-        <w:t>About 1759 words, roughly 13.5 minutes at 130 words per minute.</w:t>
+        <w:t>About 1815 words, roughly 14.0 minutes at 130 words per minute.</w:t>
       </w:r>
     </w:p>
     <w:p>
@@ -847,6 +871,17 @@
       </w:pPr>
       <w:r>
         <w:t>Pocket Answers for Questions</w:t>
+      </w:r>
+    </w:p>
+    <w:p>
+      <w:r>
+        <w:rPr>
+          <w:b/>
+        </w:rPr>
+        <w:t xml:space="preserve">What do you mean by adjusted prevalence? </w:t>
+      </w:r>
+      <w:r>
+        <w:t>In my talk it is model-predicted prevalence from Stata's margins: the predicted probability at a fixed trauma and stressor level, averaged over everyone's own age, gender, education, and state. It is marginal standardization, so the curves compare trauma levels at the same covariate mix. In Salma's talk the prevalence estimates are crude proportions; only the confidence intervals account for the design, and the adjusted quantities there are the prevalence ratios.</w:t>
       </w:r>
     </w:p>
     <w:p>
@@ -923,7 +958,7 @@
         <w:t xml:space="preserve">Is the GAD-7 valid here? </w:t>
       </w:r>
       <w:r>
-        <w:t>Jaimie's paper shows its discrimination is limited, so we read the anxiety results cautiously. The saturation pattern does not depend on anxiety; it is clearest for PTSD, which uses the best-validated instrument.</w:t>
+        <w:t>Jaimie's paper shows its discrimination is limited, so we read the anxiety results cautiously. The saturation pattern is clearest for PTSD, which uses the best-validated instrument.</w:t>
       </w:r>
     </w:p>
     <w:sectPr>

</xml_diff>